<commit_message>
Added JavaScript for functionality and made the website responsive
</commit_message>
<xml_diff>
--- a/ST10467169 - IWED Website Proposal.docx
+++ b/ST10467169 - IWED Website Proposal.docx
@@ -1221,10 +1221,7 @@
       </w:r>
       <w:proofErr w:type="spellEnd"/>
       <w:r>
-        <w:t>, 2006</w:t>
-      </w:r>
-      <w:r>
-        <w:t>).</w:t>
+        <w:t>, 2006).</w:t>
       </w:r>
     </w:p>
     <w:p>
@@ -2408,6 +2405,309 @@
       </w:r>
     </w:p>
     <w:p/>
+    <w:p>
+      <w:pPr>
+        <w:rPr>
+          <w:u w:val="single"/>
+        </w:rPr>
+      </w:pPr>
+      <w:r>
+        <w:rPr>
+          <w:u w:val="single"/>
+        </w:rPr>
+        <w:t xml:space="preserve">Part 3: </w:t>
+      </w:r>
+      <w:r>
+        <w:rPr>
+          <w:u w:val="single"/>
+        </w:rPr>
+        <w:t>Refinements and Improvements from Part 2 Feedback and Reflection</w:t>
+      </w:r>
+    </w:p>
+    <w:p>
+      <w:pPr>
+        <w:pStyle w:val="ListParagraph"/>
+        <w:numPr>
+          <w:ilvl w:val="0"/>
+          <w:numId w:val="14"/>
+        </w:numPr>
+      </w:pPr>
+      <w:r>
+        <w:t xml:space="preserve">Fixed height for the </w:t>
+      </w:r>
+      <w:r>
+        <w:t xml:space="preserve">contact form and map </w:t>
+      </w:r>
+      <w:proofErr w:type="spellStart"/>
+      <w:r>
+        <w:t>iframe</w:t>
+      </w:r>
+      <w:proofErr w:type="spellEnd"/>
+      <w:r>
+        <w:t xml:space="preserve"> on the mobile version</w:t>
+      </w:r>
+    </w:p>
+    <w:p>
+      <w:pPr>
+        <w:pStyle w:val="ListParagraph"/>
+        <w:numPr>
+          <w:ilvl w:val="0"/>
+          <w:numId w:val="14"/>
+        </w:numPr>
+      </w:pPr>
+      <w:r>
+        <w:t xml:space="preserve">The hover function was not working on some </w:t>
+      </w:r>
+      <w:proofErr w:type="gramStart"/>
+      <w:r>
+        <w:t>images</w:t>
+      </w:r>
+      <w:proofErr w:type="gramEnd"/>
+      <w:r>
+        <w:t xml:space="preserve"> so I fixed it. </w:t>
+      </w:r>
+    </w:p>
+    <w:p>
+      <w:pPr>
+        <w:pStyle w:val="pdq2pgselectionanchorcontainer"/>
+        <w:numPr>
+          <w:ilvl w:val="0"/>
+          <w:numId w:val="14"/>
+        </w:numPr>
+        <w:rPr>
+          <w:rFonts w:asciiTheme="minorHAnsi" w:hAnsiTheme="minorHAnsi"/>
+        </w:rPr>
+      </w:pPr>
+      <w:r>
+        <w:rPr>
+          <w:rFonts w:asciiTheme="minorHAnsi" w:hAnsiTheme="minorHAnsi"/>
+        </w:rPr>
+        <w:t>Initially, a hover effect was applied to property images to change their opacity on desktop devices. However, it was found that this effect does not work on mobile devices because touch screens do not support hover interactions.</w:t>
+      </w:r>
+    </w:p>
+    <w:p>
+      <w:pPr>
+        <w:pStyle w:val="NormalWeb"/>
+        <w:ind w:left="720"/>
+        <w:rPr>
+          <w:rFonts w:asciiTheme="minorHAnsi" w:hAnsiTheme="minorHAnsi"/>
+        </w:rPr>
+      </w:pPr>
+      <w:r>
+        <w:rPr>
+          <w:rFonts w:asciiTheme="minorHAnsi" w:hAnsiTheme="minorHAnsi"/>
+        </w:rPr>
+        <w:t>To improve usability, the hover effect was kept for desktop screens, and on mobile devices the images were set to full opacity for better visibility</w:t>
+      </w:r>
+    </w:p>
+    <w:p>
+      <w:pPr>
+        <w:pStyle w:val="ListParagraph"/>
+      </w:pPr>
+    </w:p>
+    <w:p>
+      <w:pPr>
+        <w:rPr>
+          <w:u w:val="single"/>
+        </w:rPr>
+      </w:pPr>
+      <w:r>
+        <w:rPr>
+          <w:u w:val="single"/>
+        </w:rPr>
+        <w:t>Going Live Steps</w:t>
+      </w:r>
+    </w:p>
+    <w:p>
+      <w:pPr>
+        <w:pStyle w:val="ListParagraph"/>
+        <w:numPr>
+          <w:ilvl w:val="0"/>
+          <w:numId w:val="15"/>
+        </w:numPr>
+      </w:pPr>
+      <w:r>
+        <w:t>Final Testing and Validation</w:t>
+      </w:r>
+    </w:p>
+    <w:p>
+      <w:pPr>
+        <w:pStyle w:val="ListParagraph"/>
+        <w:numPr>
+          <w:ilvl w:val="0"/>
+          <w:numId w:val="14"/>
+        </w:numPr>
+      </w:pPr>
+      <w:r>
+        <w:t>All links between pages work well</w:t>
+      </w:r>
+    </w:p>
+    <w:p>
+      <w:pPr>
+        <w:pStyle w:val="ListParagraph"/>
+        <w:numPr>
+          <w:ilvl w:val="0"/>
+          <w:numId w:val="14"/>
+        </w:numPr>
+      </w:pPr>
+      <w:r>
+        <w:t>Forms and embedded elements display correctly</w:t>
+      </w:r>
+    </w:p>
+    <w:p>
+      <w:pPr>
+        <w:pStyle w:val="ListParagraph"/>
+        <w:numPr>
+          <w:ilvl w:val="0"/>
+          <w:numId w:val="14"/>
+        </w:numPr>
+      </w:pPr>
+      <w:r>
+        <w:t>JavaScript functionality works</w:t>
+      </w:r>
+    </w:p>
+    <w:p>
+      <w:pPr>
+        <w:pStyle w:val="ListParagraph"/>
+        <w:numPr>
+          <w:ilvl w:val="0"/>
+          <w:numId w:val="14"/>
+        </w:numPr>
+      </w:pPr>
+      <w:r>
+        <w:t>The website layout is responsive</w:t>
+      </w:r>
+    </w:p>
+    <w:p>
+      <w:r>
+        <w:lastRenderedPageBreak/>
+        <w:t>JavaScript:</w:t>
+      </w:r>
+    </w:p>
+    <w:p>
+      <w:pPr>
+        <w:pStyle w:val="ListParagraph"/>
+        <w:numPr>
+          <w:ilvl w:val="0"/>
+          <w:numId w:val="17"/>
+        </w:numPr>
+      </w:pPr>
+      <w:r>
+        <w:t>The main JavaScript functionality used is the hamburger navigation menu</w:t>
+      </w:r>
+      <w:r>
+        <w:t xml:space="preserve"> for mobile devices. </w:t>
+      </w:r>
+    </w:p>
+    <w:p>
+      <w:pPr>
+        <w:pStyle w:val="ListParagraph"/>
+        <w:numPr>
+          <w:ilvl w:val="0"/>
+          <w:numId w:val="17"/>
+        </w:numPr>
+      </w:pPr>
+      <w:r>
+        <w:t>JavaScript was also used to automatically update the copyright year in the footer.</w:t>
+      </w:r>
+    </w:p>
+    <w:p>
+      <w:r>
+        <w:t>Mobile Responsiveness:</w:t>
+      </w:r>
+    </w:p>
+    <w:p>
+      <w:pPr>
+        <w:pStyle w:val="ListParagraph"/>
+        <w:numPr>
+          <w:ilvl w:val="0"/>
+          <w:numId w:val="18"/>
+        </w:numPr>
+      </w:pPr>
+      <w:r>
+        <w:t>The navigation menu was changed from a horizontal layout on desktop to a hamburger menu on mobile devices.</w:t>
+      </w:r>
+    </w:p>
+    <w:p>
+      <w:pPr>
+        <w:pStyle w:val="ListParagraph"/>
+        <w:numPr>
+          <w:ilvl w:val="0"/>
+          <w:numId w:val="18"/>
+        </w:numPr>
+      </w:pPr>
+      <w:r>
+        <w:t>All images were set to scale automatically using relative widths so that they adjust to the screen size without overflowing or breaking the layout.</w:t>
+      </w:r>
+    </w:p>
+    <w:p>
+      <w:pPr>
+        <w:pStyle w:val="ListParagraph"/>
+        <w:numPr>
+          <w:ilvl w:val="0"/>
+          <w:numId w:val="18"/>
+        </w:numPr>
+      </w:pPr>
+      <w:r>
+        <w:t>The embedded Google Form and Google Map were placed inside a responsive container to ensure they scale properly on mobile devices.</w:t>
+      </w:r>
+    </w:p>
+    <w:p>
+      <w:r>
+        <w:t>Search engine optimisation:</w:t>
+      </w:r>
+    </w:p>
+    <w:p>
+      <w:pPr>
+        <w:pStyle w:val="ListParagraph"/>
+        <w:numPr>
+          <w:ilvl w:val="0"/>
+          <w:numId w:val="16"/>
+        </w:numPr>
+      </w:pPr>
+      <w:r>
+        <w:t>Added a meta description on the home page</w:t>
+      </w:r>
+      <w:r>
+        <w:t xml:space="preserve">. </w:t>
+      </w:r>
+      <w:r>
+        <w:t xml:space="preserve">A meta description is important as it helps the search engine understand the website content. </w:t>
+      </w:r>
+    </w:p>
+    <w:p>
+      <w:pPr>
+        <w:pStyle w:val="ListParagraph"/>
+        <w:numPr>
+          <w:ilvl w:val="0"/>
+          <w:numId w:val="16"/>
+        </w:numPr>
+      </w:pPr>
+      <w:r>
+        <w:t>Added an alternative text to the property images. This is so the search engine could pick up on which property is for sale or rental and display those images as part of search results.</w:t>
+      </w:r>
+    </w:p>
+    <w:p>
+      <w:pPr>
+        <w:pStyle w:val="ListParagraph"/>
+        <w:numPr>
+          <w:ilvl w:val="0"/>
+          <w:numId w:val="16"/>
+        </w:numPr>
+      </w:pPr>
+      <w:r>
+        <w:t>Added an alt</w:t>
+      </w:r>
+      <w:r>
+        <w:t xml:space="preserve">ernative text to the business </w:t>
+      </w:r>
+      <w:r>
+        <w:t>stakeholders’</w:t>
+      </w:r>
+      <w:r>
+        <w:t xml:space="preserve"> images (this was done in part 1 of the assignment).</w:t>
+      </w:r>
+    </w:p>
     <w:sectPr>
       <w:pgSz w:w="11906" w:h="16838"/>
       <w:pgMar w:top="1440" w:right="1440" w:bottom="1440" w:left="1440" w:header="708" w:footer="708" w:gutter="0"/>
@@ -2923,6 +3223,232 @@
     </w:lvl>
   </w:abstractNum>
   <w:abstractNum w:abstractNumId="4" w15:restartNumberingAfterBreak="0">
+    <w:nsid w:val="18553D3D"/>
+    <w:multiLevelType w:val="hybridMultilevel"/>
+    <w:tmpl w:val="1A7C7AF0"/>
+    <w:lvl w:ilvl="0" w:tplc="1C090001">
+      <w:start w:val="1"/>
+      <w:numFmt w:val="bullet"/>
+      <w:lvlText w:val=""/>
+      <w:lvlJc w:val="left"/>
+      <w:pPr>
+        <w:ind w:left="720" w:hanging="360"/>
+      </w:pPr>
+      <w:rPr>
+        <w:rFonts w:ascii="Symbol" w:hAnsi="Symbol" w:hint="default"/>
+      </w:rPr>
+    </w:lvl>
+    <w:lvl w:ilvl="1" w:tplc="1C090003" w:tentative="1">
+      <w:start w:val="1"/>
+      <w:numFmt w:val="bullet"/>
+      <w:lvlText w:val="o"/>
+      <w:lvlJc w:val="left"/>
+      <w:pPr>
+        <w:ind w:left="1440" w:hanging="360"/>
+      </w:pPr>
+      <w:rPr>
+        <w:rFonts w:ascii="Courier New" w:hAnsi="Courier New" w:cs="Courier New" w:hint="default"/>
+      </w:rPr>
+    </w:lvl>
+    <w:lvl w:ilvl="2" w:tplc="1C090005" w:tentative="1">
+      <w:start w:val="1"/>
+      <w:numFmt w:val="bullet"/>
+      <w:lvlText w:val=""/>
+      <w:lvlJc w:val="left"/>
+      <w:pPr>
+        <w:ind w:left="2160" w:hanging="360"/>
+      </w:pPr>
+      <w:rPr>
+        <w:rFonts w:ascii="Wingdings" w:hAnsi="Wingdings" w:hint="default"/>
+      </w:rPr>
+    </w:lvl>
+    <w:lvl w:ilvl="3" w:tplc="1C090001" w:tentative="1">
+      <w:start w:val="1"/>
+      <w:numFmt w:val="bullet"/>
+      <w:lvlText w:val=""/>
+      <w:lvlJc w:val="left"/>
+      <w:pPr>
+        <w:ind w:left="2880" w:hanging="360"/>
+      </w:pPr>
+      <w:rPr>
+        <w:rFonts w:ascii="Symbol" w:hAnsi="Symbol" w:hint="default"/>
+      </w:rPr>
+    </w:lvl>
+    <w:lvl w:ilvl="4" w:tplc="1C090003" w:tentative="1">
+      <w:start w:val="1"/>
+      <w:numFmt w:val="bullet"/>
+      <w:lvlText w:val="o"/>
+      <w:lvlJc w:val="left"/>
+      <w:pPr>
+        <w:ind w:left="3600" w:hanging="360"/>
+      </w:pPr>
+      <w:rPr>
+        <w:rFonts w:ascii="Courier New" w:hAnsi="Courier New" w:cs="Courier New" w:hint="default"/>
+      </w:rPr>
+    </w:lvl>
+    <w:lvl w:ilvl="5" w:tplc="1C090005" w:tentative="1">
+      <w:start w:val="1"/>
+      <w:numFmt w:val="bullet"/>
+      <w:lvlText w:val=""/>
+      <w:lvlJc w:val="left"/>
+      <w:pPr>
+        <w:ind w:left="4320" w:hanging="360"/>
+      </w:pPr>
+      <w:rPr>
+        <w:rFonts w:ascii="Wingdings" w:hAnsi="Wingdings" w:hint="default"/>
+      </w:rPr>
+    </w:lvl>
+    <w:lvl w:ilvl="6" w:tplc="1C090001" w:tentative="1">
+      <w:start w:val="1"/>
+      <w:numFmt w:val="bullet"/>
+      <w:lvlText w:val=""/>
+      <w:lvlJc w:val="left"/>
+      <w:pPr>
+        <w:ind w:left="5040" w:hanging="360"/>
+      </w:pPr>
+      <w:rPr>
+        <w:rFonts w:ascii="Symbol" w:hAnsi="Symbol" w:hint="default"/>
+      </w:rPr>
+    </w:lvl>
+    <w:lvl w:ilvl="7" w:tplc="1C090003" w:tentative="1">
+      <w:start w:val="1"/>
+      <w:numFmt w:val="bullet"/>
+      <w:lvlText w:val="o"/>
+      <w:lvlJc w:val="left"/>
+      <w:pPr>
+        <w:ind w:left="5760" w:hanging="360"/>
+      </w:pPr>
+      <w:rPr>
+        <w:rFonts w:ascii="Courier New" w:hAnsi="Courier New" w:cs="Courier New" w:hint="default"/>
+      </w:rPr>
+    </w:lvl>
+    <w:lvl w:ilvl="8" w:tplc="1C090005" w:tentative="1">
+      <w:start w:val="1"/>
+      <w:numFmt w:val="bullet"/>
+      <w:lvlText w:val=""/>
+      <w:lvlJc w:val="left"/>
+      <w:pPr>
+        <w:ind w:left="6480" w:hanging="360"/>
+      </w:pPr>
+      <w:rPr>
+        <w:rFonts w:ascii="Wingdings" w:hAnsi="Wingdings" w:hint="default"/>
+      </w:rPr>
+    </w:lvl>
+  </w:abstractNum>
+  <w:abstractNum w:abstractNumId="5" w15:restartNumberingAfterBreak="0">
+    <w:nsid w:val="1ACE08AC"/>
+    <w:multiLevelType w:val="hybridMultilevel"/>
+    <w:tmpl w:val="D4DA44BA"/>
+    <w:lvl w:ilvl="0" w:tplc="1C090001">
+      <w:start w:val="1"/>
+      <w:numFmt w:val="bullet"/>
+      <w:lvlText w:val=""/>
+      <w:lvlJc w:val="left"/>
+      <w:pPr>
+        <w:ind w:left="720" w:hanging="360"/>
+      </w:pPr>
+      <w:rPr>
+        <w:rFonts w:ascii="Symbol" w:hAnsi="Symbol" w:hint="default"/>
+      </w:rPr>
+    </w:lvl>
+    <w:lvl w:ilvl="1" w:tplc="1C090003" w:tentative="1">
+      <w:start w:val="1"/>
+      <w:numFmt w:val="bullet"/>
+      <w:lvlText w:val="o"/>
+      <w:lvlJc w:val="left"/>
+      <w:pPr>
+        <w:ind w:left="1440" w:hanging="360"/>
+      </w:pPr>
+      <w:rPr>
+        <w:rFonts w:ascii="Courier New" w:hAnsi="Courier New" w:cs="Courier New" w:hint="default"/>
+      </w:rPr>
+    </w:lvl>
+    <w:lvl w:ilvl="2" w:tplc="1C090005" w:tentative="1">
+      <w:start w:val="1"/>
+      <w:numFmt w:val="bullet"/>
+      <w:lvlText w:val=""/>
+      <w:lvlJc w:val="left"/>
+      <w:pPr>
+        <w:ind w:left="2160" w:hanging="360"/>
+      </w:pPr>
+      <w:rPr>
+        <w:rFonts w:ascii="Wingdings" w:hAnsi="Wingdings" w:hint="default"/>
+      </w:rPr>
+    </w:lvl>
+    <w:lvl w:ilvl="3" w:tplc="1C090001" w:tentative="1">
+      <w:start w:val="1"/>
+      <w:numFmt w:val="bullet"/>
+      <w:lvlText w:val=""/>
+      <w:lvlJc w:val="left"/>
+      <w:pPr>
+        <w:ind w:left="2880" w:hanging="360"/>
+      </w:pPr>
+      <w:rPr>
+        <w:rFonts w:ascii="Symbol" w:hAnsi="Symbol" w:hint="default"/>
+      </w:rPr>
+    </w:lvl>
+    <w:lvl w:ilvl="4" w:tplc="1C090003" w:tentative="1">
+      <w:start w:val="1"/>
+      <w:numFmt w:val="bullet"/>
+      <w:lvlText w:val="o"/>
+      <w:lvlJc w:val="left"/>
+      <w:pPr>
+        <w:ind w:left="3600" w:hanging="360"/>
+      </w:pPr>
+      <w:rPr>
+        <w:rFonts w:ascii="Courier New" w:hAnsi="Courier New" w:cs="Courier New" w:hint="default"/>
+      </w:rPr>
+    </w:lvl>
+    <w:lvl w:ilvl="5" w:tplc="1C090005" w:tentative="1">
+      <w:start w:val="1"/>
+      <w:numFmt w:val="bullet"/>
+      <w:lvlText w:val=""/>
+      <w:lvlJc w:val="left"/>
+      <w:pPr>
+        <w:ind w:left="4320" w:hanging="360"/>
+      </w:pPr>
+      <w:rPr>
+        <w:rFonts w:ascii="Wingdings" w:hAnsi="Wingdings" w:hint="default"/>
+      </w:rPr>
+    </w:lvl>
+    <w:lvl w:ilvl="6" w:tplc="1C090001" w:tentative="1">
+      <w:start w:val="1"/>
+      <w:numFmt w:val="bullet"/>
+      <w:lvlText w:val=""/>
+      <w:lvlJc w:val="left"/>
+      <w:pPr>
+        <w:ind w:left="5040" w:hanging="360"/>
+      </w:pPr>
+      <w:rPr>
+        <w:rFonts w:ascii="Symbol" w:hAnsi="Symbol" w:hint="default"/>
+      </w:rPr>
+    </w:lvl>
+    <w:lvl w:ilvl="7" w:tplc="1C090003" w:tentative="1">
+      <w:start w:val="1"/>
+      <w:numFmt w:val="bullet"/>
+      <w:lvlText w:val="o"/>
+      <w:lvlJc w:val="left"/>
+      <w:pPr>
+        <w:ind w:left="5760" w:hanging="360"/>
+      </w:pPr>
+      <w:rPr>
+        <w:rFonts w:ascii="Courier New" w:hAnsi="Courier New" w:cs="Courier New" w:hint="default"/>
+      </w:rPr>
+    </w:lvl>
+    <w:lvl w:ilvl="8" w:tplc="1C090005" w:tentative="1">
+      <w:start w:val="1"/>
+      <w:numFmt w:val="bullet"/>
+      <w:lvlText w:val=""/>
+      <w:lvlJc w:val="left"/>
+      <w:pPr>
+        <w:ind w:left="6480" w:hanging="360"/>
+      </w:pPr>
+      <w:rPr>
+        <w:rFonts w:ascii="Wingdings" w:hAnsi="Wingdings" w:hint="default"/>
+      </w:rPr>
+    </w:lvl>
+  </w:abstractNum>
+  <w:abstractNum w:abstractNumId="6" w15:restartNumberingAfterBreak="0">
     <w:nsid w:val="1E0B4831"/>
     <w:multiLevelType w:val="multilevel"/>
     <w:tmpl w:val="4B4AD8FA"/>
@@ -3035,7 +3561,7 @@
       </w:rPr>
     </w:lvl>
   </w:abstractNum>
-  <w:abstractNum w:abstractNumId="5" w15:restartNumberingAfterBreak="0">
+  <w:abstractNum w:abstractNumId="7" w15:restartNumberingAfterBreak="0">
     <w:nsid w:val="273B3A42"/>
     <w:multiLevelType w:val="multilevel"/>
     <w:tmpl w:val="4B4AD8FA"/>
@@ -3148,7 +3674,7 @@
       </w:rPr>
     </w:lvl>
   </w:abstractNum>
-  <w:abstractNum w:abstractNumId="6" w15:restartNumberingAfterBreak="0">
+  <w:abstractNum w:abstractNumId="8" w15:restartNumberingAfterBreak="0">
     <w:nsid w:val="2ED269CA"/>
     <w:multiLevelType w:val="hybridMultilevel"/>
     <w:tmpl w:val="6B4243FA"/>
@@ -3261,7 +3787,7 @@
       </w:rPr>
     </w:lvl>
   </w:abstractNum>
-  <w:abstractNum w:abstractNumId="7" w15:restartNumberingAfterBreak="0">
+  <w:abstractNum w:abstractNumId="9" w15:restartNumberingAfterBreak="0">
     <w:nsid w:val="36D308B7"/>
     <w:multiLevelType w:val="multilevel"/>
     <w:tmpl w:val="F4364418"/>
@@ -3374,7 +3900,7 @@
       </w:rPr>
     </w:lvl>
   </w:abstractNum>
-  <w:abstractNum w:abstractNumId="8" w15:restartNumberingAfterBreak="0">
+  <w:abstractNum w:abstractNumId="10" w15:restartNumberingAfterBreak="0">
     <w:nsid w:val="385B407C"/>
     <w:multiLevelType w:val="hybridMultilevel"/>
     <w:tmpl w:val="1B24A8AC"/>
@@ -3487,7 +4013,7 @@
       </w:rPr>
     </w:lvl>
   </w:abstractNum>
-  <w:abstractNum w:abstractNumId="9" w15:restartNumberingAfterBreak="0">
+  <w:abstractNum w:abstractNumId="11" w15:restartNumberingAfterBreak="0">
     <w:nsid w:val="3B7D734C"/>
     <w:multiLevelType w:val="multilevel"/>
     <w:tmpl w:val="0964C022"/>
@@ -3600,7 +4126,96 @@
       </w:rPr>
     </w:lvl>
   </w:abstractNum>
-  <w:abstractNum w:abstractNumId="10" w15:restartNumberingAfterBreak="0">
+  <w:abstractNum w:abstractNumId="12" w15:restartNumberingAfterBreak="0">
+    <w:nsid w:val="48EE1CD8"/>
+    <w:multiLevelType w:val="hybridMultilevel"/>
+    <w:tmpl w:val="9070C3AC"/>
+    <w:lvl w:ilvl="0" w:tplc="1C09000F">
+      <w:start w:val="1"/>
+      <w:numFmt w:val="decimal"/>
+      <w:lvlText w:val="%1."/>
+      <w:lvlJc w:val="left"/>
+      <w:pPr>
+        <w:ind w:left="720" w:hanging="360"/>
+      </w:pPr>
+      <w:rPr>
+        <w:rFonts w:hint="default"/>
+      </w:rPr>
+    </w:lvl>
+    <w:lvl w:ilvl="1" w:tplc="1C090019" w:tentative="1">
+      <w:start w:val="1"/>
+      <w:numFmt w:val="lowerLetter"/>
+      <w:lvlText w:val="%2."/>
+      <w:lvlJc w:val="left"/>
+      <w:pPr>
+        <w:ind w:left="1440" w:hanging="360"/>
+      </w:pPr>
+    </w:lvl>
+    <w:lvl w:ilvl="2" w:tplc="1C09001B" w:tentative="1">
+      <w:start w:val="1"/>
+      <w:numFmt w:val="lowerRoman"/>
+      <w:lvlText w:val="%3."/>
+      <w:lvlJc w:val="right"/>
+      <w:pPr>
+        <w:ind w:left="2160" w:hanging="180"/>
+      </w:pPr>
+    </w:lvl>
+    <w:lvl w:ilvl="3" w:tplc="1C09000F" w:tentative="1">
+      <w:start w:val="1"/>
+      <w:numFmt w:val="decimal"/>
+      <w:lvlText w:val="%4."/>
+      <w:lvlJc w:val="left"/>
+      <w:pPr>
+        <w:ind w:left="2880" w:hanging="360"/>
+      </w:pPr>
+    </w:lvl>
+    <w:lvl w:ilvl="4" w:tplc="1C090019" w:tentative="1">
+      <w:start w:val="1"/>
+      <w:numFmt w:val="lowerLetter"/>
+      <w:lvlText w:val="%5."/>
+      <w:lvlJc w:val="left"/>
+      <w:pPr>
+        <w:ind w:left="3600" w:hanging="360"/>
+      </w:pPr>
+    </w:lvl>
+    <w:lvl w:ilvl="5" w:tplc="1C09001B" w:tentative="1">
+      <w:start w:val="1"/>
+      <w:numFmt w:val="lowerRoman"/>
+      <w:lvlText w:val="%6."/>
+      <w:lvlJc w:val="right"/>
+      <w:pPr>
+        <w:ind w:left="4320" w:hanging="180"/>
+      </w:pPr>
+    </w:lvl>
+    <w:lvl w:ilvl="6" w:tplc="1C09000F" w:tentative="1">
+      <w:start w:val="1"/>
+      <w:numFmt w:val="decimal"/>
+      <w:lvlText w:val="%7."/>
+      <w:lvlJc w:val="left"/>
+      <w:pPr>
+        <w:ind w:left="5040" w:hanging="360"/>
+      </w:pPr>
+    </w:lvl>
+    <w:lvl w:ilvl="7" w:tplc="1C090019" w:tentative="1">
+      <w:start w:val="1"/>
+      <w:numFmt w:val="lowerLetter"/>
+      <w:lvlText w:val="%8."/>
+      <w:lvlJc w:val="left"/>
+      <w:pPr>
+        <w:ind w:left="5760" w:hanging="360"/>
+      </w:pPr>
+    </w:lvl>
+    <w:lvl w:ilvl="8" w:tplc="1C09001B" w:tentative="1">
+      <w:start w:val="1"/>
+      <w:numFmt w:val="lowerRoman"/>
+      <w:lvlText w:val="%9."/>
+      <w:lvlJc w:val="right"/>
+      <w:pPr>
+        <w:ind w:left="6480" w:hanging="180"/>
+      </w:pPr>
+    </w:lvl>
+  </w:abstractNum>
+  <w:abstractNum w:abstractNumId="13" w15:restartNumberingAfterBreak="0">
     <w:nsid w:val="66896FBA"/>
     <w:multiLevelType w:val="hybridMultilevel"/>
     <w:tmpl w:val="158286C8"/>
@@ -3713,7 +4328,96 @@
       </w:rPr>
     </w:lvl>
   </w:abstractNum>
-  <w:abstractNum w:abstractNumId="11" w15:restartNumberingAfterBreak="0">
+  <w:abstractNum w:abstractNumId="14" w15:restartNumberingAfterBreak="0">
+    <w:nsid w:val="6CFD62C4"/>
+    <w:multiLevelType w:val="hybridMultilevel"/>
+    <w:tmpl w:val="677A51A6"/>
+    <w:lvl w:ilvl="0" w:tplc="1C09000F">
+      <w:start w:val="1"/>
+      <w:numFmt w:val="decimal"/>
+      <w:lvlText w:val="%1."/>
+      <w:lvlJc w:val="left"/>
+      <w:pPr>
+        <w:ind w:left="720" w:hanging="360"/>
+      </w:pPr>
+      <w:rPr>
+        <w:rFonts w:hint="default"/>
+      </w:rPr>
+    </w:lvl>
+    <w:lvl w:ilvl="1" w:tplc="1C090019" w:tentative="1">
+      <w:start w:val="1"/>
+      <w:numFmt w:val="lowerLetter"/>
+      <w:lvlText w:val="%2."/>
+      <w:lvlJc w:val="left"/>
+      <w:pPr>
+        <w:ind w:left="1440" w:hanging="360"/>
+      </w:pPr>
+    </w:lvl>
+    <w:lvl w:ilvl="2" w:tplc="1C09001B" w:tentative="1">
+      <w:start w:val="1"/>
+      <w:numFmt w:val="lowerRoman"/>
+      <w:lvlText w:val="%3."/>
+      <w:lvlJc w:val="right"/>
+      <w:pPr>
+        <w:ind w:left="2160" w:hanging="180"/>
+      </w:pPr>
+    </w:lvl>
+    <w:lvl w:ilvl="3" w:tplc="1C09000F" w:tentative="1">
+      <w:start w:val="1"/>
+      <w:numFmt w:val="decimal"/>
+      <w:lvlText w:val="%4."/>
+      <w:lvlJc w:val="left"/>
+      <w:pPr>
+        <w:ind w:left="2880" w:hanging="360"/>
+      </w:pPr>
+    </w:lvl>
+    <w:lvl w:ilvl="4" w:tplc="1C090019" w:tentative="1">
+      <w:start w:val="1"/>
+      <w:numFmt w:val="lowerLetter"/>
+      <w:lvlText w:val="%5."/>
+      <w:lvlJc w:val="left"/>
+      <w:pPr>
+        <w:ind w:left="3600" w:hanging="360"/>
+      </w:pPr>
+    </w:lvl>
+    <w:lvl w:ilvl="5" w:tplc="1C09001B" w:tentative="1">
+      <w:start w:val="1"/>
+      <w:numFmt w:val="lowerRoman"/>
+      <w:lvlText w:val="%6."/>
+      <w:lvlJc w:val="right"/>
+      <w:pPr>
+        <w:ind w:left="4320" w:hanging="180"/>
+      </w:pPr>
+    </w:lvl>
+    <w:lvl w:ilvl="6" w:tplc="1C09000F" w:tentative="1">
+      <w:start w:val="1"/>
+      <w:numFmt w:val="decimal"/>
+      <w:lvlText w:val="%7."/>
+      <w:lvlJc w:val="left"/>
+      <w:pPr>
+        <w:ind w:left="5040" w:hanging="360"/>
+      </w:pPr>
+    </w:lvl>
+    <w:lvl w:ilvl="7" w:tplc="1C090019" w:tentative="1">
+      <w:start w:val="1"/>
+      <w:numFmt w:val="lowerLetter"/>
+      <w:lvlText w:val="%8."/>
+      <w:lvlJc w:val="left"/>
+      <w:pPr>
+        <w:ind w:left="5760" w:hanging="360"/>
+      </w:pPr>
+    </w:lvl>
+    <w:lvl w:ilvl="8" w:tplc="1C09001B" w:tentative="1">
+      <w:start w:val="1"/>
+      <w:numFmt w:val="lowerRoman"/>
+      <w:lvlText w:val="%9."/>
+      <w:lvlJc w:val="right"/>
+      <w:pPr>
+        <w:ind w:left="6480" w:hanging="180"/>
+      </w:pPr>
+    </w:lvl>
+  </w:abstractNum>
+  <w:abstractNum w:abstractNumId="15" w15:restartNumberingAfterBreak="0">
     <w:nsid w:val="6D8978B4"/>
     <w:multiLevelType w:val="hybridMultilevel"/>
     <w:tmpl w:val="AB989A16"/>
@@ -3826,10 +4530,123 @@
       </w:rPr>
     </w:lvl>
   </w:abstractNum>
-  <w:abstractNum w:abstractNumId="12" w15:restartNumberingAfterBreak="0">
+  <w:abstractNum w:abstractNumId="16" w15:restartNumberingAfterBreak="0">
     <w:nsid w:val="6E1570E6"/>
     <w:multiLevelType w:val="hybridMultilevel"/>
     <w:tmpl w:val="F2B47C7E"/>
+    <w:lvl w:ilvl="0" w:tplc="1C090001">
+      <w:start w:val="1"/>
+      <w:numFmt w:val="bullet"/>
+      <w:lvlText w:val=""/>
+      <w:lvlJc w:val="left"/>
+      <w:pPr>
+        <w:ind w:left="720" w:hanging="360"/>
+      </w:pPr>
+      <w:rPr>
+        <w:rFonts w:ascii="Symbol" w:hAnsi="Symbol" w:hint="default"/>
+      </w:rPr>
+    </w:lvl>
+    <w:lvl w:ilvl="1" w:tplc="1C090003" w:tentative="1">
+      <w:start w:val="1"/>
+      <w:numFmt w:val="bullet"/>
+      <w:lvlText w:val="o"/>
+      <w:lvlJc w:val="left"/>
+      <w:pPr>
+        <w:ind w:left="1440" w:hanging="360"/>
+      </w:pPr>
+      <w:rPr>
+        <w:rFonts w:ascii="Courier New" w:hAnsi="Courier New" w:cs="Courier New" w:hint="default"/>
+      </w:rPr>
+    </w:lvl>
+    <w:lvl w:ilvl="2" w:tplc="1C090005" w:tentative="1">
+      <w:start w:val="1"/>
+      <w:numFmt w:val="bullet"/>
+      <w:lvlText w:val=""/>
+      <w:lvlJc w:val="left"/>
+      <w:pPr>
+        <w:ind w:left="2160" w:hanging="360"/>
+      </w:pPr>
+      <w:rPr>
+        <w:rFonts w:ascii="Wingdings" w:hAnsi="Wingdings" w:hint="default"/>
+      </w:rPr>
+    </w:lvl>
+    <w:lvl w:ilvl="3" w:tplc="1C090001" w:tentative="1">
+      <w:start w:val="1"/>
+      <w:numFmt w:val="bullet"/>
+      <w:lvlText w:val=""/>
+      <w:lvlJc w:val="left"/>
+      <w:pPr>
+        <w:ind w:left="2880" w:hanging="360"/>
+      </w:pPr>
+      <w:rPr>
+        <w:rFonts w:ascii="Symbol" w:hAnsi="Symbol" w:hint="default"/>
+      </w:rPr>
+    </w:lvl>
+    <w:lvl w:ilvl="4" w:tplc="1C090003" w:tentative="1">
+      <w:start w:val="1"/>
+      <w:numFmt w:val="bullet"/>
+      <w:lvlText w:val="o"/>
+      <w:lvlJc w:val="left"/>
+      <w:pPr>
+        <w:ind w:left="3600" w:hanging="360"/>
+      </w:pPr>
+      <w:rPr>
+        <w:rFonts w:ascii="Courier New" w:hAnsi="Courier New" w:cs="Courier New" w:hint="default"/>
+      </w:rPr>
+    </w:lvl>
+    <w:lvl w:ilvl="5" w:tplc="1C090005" w:tentative="1">
+      <w:start w:val="1"/>
+      <w:numFmt w:val="bullet"/>
+      <w:lvlText w:val=""/>
+      <w:lvlJc w:val="left"/>
+      <w:pPr>
+        <w:ind w:left="4320" w:hanging="360"/>
+      </w:pPr>
+      <w:rPr>
+        <w:rFonts w:ascii="Wingdings" w:hAnsi="Wingdings" w:hint="default"/>
+      </w:rPr>
+    </w:lvl>
+    <w:lvl w:ilvl="6" w:tplc="1C090001" w:tentative="1">
+      <w:start w:val="1"/>
+      <w:numFmt w:val="bullet"/>
+      <w:lvlText w:val=""/>
+      <w:lvlJc w:val="left"/>
+      <w:pPr>
+        <w:ind w:left="5040" w:hanging="360"/>
+      </w:pPr>
+      <w:rPr>
+        <w:rFonts w:ascii="Symbol" w:hAnsi="Symbol" w:hint="default"/>
+      </w:rPr>
+    </w:lvl>
+    <w:lvl w:ilvl="7" w:tplc="1C090003" w:tentative="1">
+      <w:start w:val="1"/>
+      <w:numFmt w:val="bullet"/>
+      <w:lvlText w:val="o"/>
+      <w:lvlJc w:val="left"/>
+      <w:pPr>
+        <w:ind w:left="5760" w:hanging="360"/>
+      </w:pPr>
+      <w:rPr>
+        <w:rFonts w:ascii="Courier New" w:hAnsi="Courier New" w:cs="Courier New" w:hint="default"/>
+      </w:rPr>
+    </w:lvl>
+    <w:lvl w:ilvl="8" w:tplc="1C090005" w:tentative="1">
+      <w:start w:val="1"/>
+      <w:numFmt w:val="bullet"/>
+      <w:lvlText w:val=""/>
+      <w:lvlJc w:val="left"/>
+      <w:pPr>
+        <w:ind w:left="6480" w:hanging="360"/>
+      </w:pPr>
+      <w:rPr>
+        <w:rFonts w:ascii="Wingdings" w:hAnsi="Wingdings" w:hint="default"/>
+      </w:rPr>
+    </w:lvl>
+  </w:abstractNum>
+  <w:abstractNum w:abstractNumId="17" w15:restartNumberingAfterBreak="0">
+    <w:nsid w:val="71DB3F20"/>
+    <w:multiLevelType w:val="hybridMultilevel"/>
+    <w:tmpl w:val="EE166BE2"/>
     <w:lvl w:ilvl="0" w:tplc="1C090001">
       <w:start w:val="1"/>
       <w:numFmt w:val="bullet"/>
@@ -3943,40 +4760,55 @@
     <w:abstractNumId w:val="0"/>
   </w:num>
   <w:num w:numId="2" w16cid:durableId="1908761824">
+    <w:abstractNumId w:val="8"/>
+  </w:num>
+  <w:num w:numId="3" w16cid:durableId="270019814">
+    <w:abstractNumId w:val="10"/>
+  </w:num>
+  <w:num w:numId="4" w16cid:durableId="1405369772">
+    <w:abstractNumId w:val="7"/>
+  </w:num>
+  <w:num w:numId="5" w16cid:durableId="1815177744">
+    <w:abstractNumId w:val="9"/>
+  </w:num>
+  <w:num w:numId="6" w16cid:durableId="841697690">
     <w:abstractNumId w:val="6"/>
   </w:num>
-  <w:num w:numId="3" w16cid:durableId="270019814">
-    <w:abstractNumId w:val="8"/>
-  </w:num>
-  <w:num w:numId="4" w16cid:durableId="1405369772">
-    <w:abstractNumId w:val="5"/>
-  </w:num>
-  <w:num w:numId="5" w16cid:durableId="1815177744">
-    <w:abstractNumId w:val="7"/>
-  </w:num>
-  <w:num w:numId="6" w16cid:durableId="841697690">
-    <w:abstractNumId w:val="4"/>
-  </w:num>
   <w:num w:numId="7" w16cid:durableId="904069909">
-    <w:abstractNumId w:val="9"/>
+    <w:abstractNumId w:val="11"/>
   </w:num>
   <w:num w:numId="8" w16cid:durableId="728265729">
     <w:abstractNumId w:val="2"/>
   </w:num>
   <w:num w:numId="9" w16cid:durableId="1319068764">
-    <w:abstractNumId w:val="11"/>
+    <w:abstractNumId w:val="15"/>
   </w:num>
   <w:num w:numId="10" w16cid:durableId="1613631692">
     <w:abstractNumId w:val="1"/>
   </w:num>
   <w:num w:numId="11" w16cid:durableId="1092817112">
-    <w:abstractNumId w:val="12"/>
+    <w:abstractNumId w:val="16"/>
   </w:num>
   <w:num w:numId="12" w16cid:durableId="1460758694">
-    <w:abstractNumId w:val="10"/>
+    <w:abstractNumId w:val="13"/>
   </w:num>
   <w:num w:numId="13" w16cid:durableId="633024438">
     <w:abstractNumId w:val="3"/>
+  </w:num>
+  <w:num w:numId="14" w16cid:durableId="1791196575">
+    <w:abstractNumId w:val="5"/>
+  </w:num>
+  <w:num w:numId="15" w16cid:durableId="1140459151">
+    <w:abstractNumId w:val="12"/>
+  </w:num>
+  <w:num w:numId="16" w16cid:durableId="2046708281">
+    <w:abstractNumId w:val="14"/>
+  </w:num>
+  <w:num w:numId="17" w16cid:durableId="645819615">
+    <w:abstractNumId w:val="17"/>
+  </w:num>
+  <w:num w:numId="18" w16cid:durableId="979304471">
+    <w:abstractNumId w:val="4"/>
   </w:num>
 </w:numbering>
 </file>
@@ -4964,6 +5796,37 @@
       <w:shd w:val="clear" w:color="auto" w:fill="E1DFDD"/>
     </w:rPr>
   </w:style>
+  <w:style w:type="paragraph" w:customStyle="1" w:styleId="pdq2pgselectionanchorcontainer">
+    <w:name w:val="pdq2pg_selectionanchorcontainer"/>
+    <w:basedOn w:val="Normal"/>
+    <w:rsid w:val="001E066A"/>
+    <w:pPr>
+      <w:spacing w:before="100" w:beforeAutospacing="1" w:after="100" w:afterAutospacing="1" w:line="240" w:lineRule="auto"/>
+    </w:pPr>
+    <w:rPr>
+      <w:rFonts w:ascii="Times New Roman" w:eastAsia="Times New Roman" w:hAnsi="Times New Roman" w:cs="Times New Roman"/>
+      <w:kern w:val="0"/>
+      <w:lang w:eastAsia="en-ZA"/>
+      <w14:ligatures w14:val="none"/>
+    </w:rPr>
+  </w:style>
+  <w:style w:type="paragraph" w:styleId="NormalWeb">
+    <w:name w:val="Normal (Web)"/>
+    <w:basedOn w:val="Normal"/>
+    <w:uiPriority w:val="99"/>
+    <w:semiHidden/>
+    <w:unhideWhenUsed/>
+    <w:rsid w:val="001E066A"/>
+    <w:pPr>
+      <w:spacing w:before="100" w:beforeAutospacing="1" w:after="100" w:afterAutospacing="1" w:line="240" w:lineRule="auto"/>
+    </w:pPr>
+    <w:rPr>
+      <w:rFonts w:ascii="Times New Roman" w:eastAsia="Times New Roman" w:hAnsi="Times New Roman" w:cs="Times New Roman"/>
+      <w:kern w:val="0"/>
+      <w:lang w:eastAsia="en-ZA"/>
+      <w14:ligatures w14:val="none"/>
+    </w:rPr>
+  </w:style>
 </w:styles>
 </file>
 

</xml_diff>